<commit_message>
Add beginner results explanation
</commit_message>
<xml_diff>
--- a/reports/Fish_Kiln_AI_Model_and_App_Results.docx
+++ b/reports/Fish_Kiln_AI_Model_and_App_Results.docx
@@ -24,7 +24,7 @@
     </w:p>
     <w:p>
       <w:r>
-        <w:t>Generated: 2026-06-27</w:t>
+        <w:t>Generated: 2026-06-29</w:t>
       </w:r>
     </w:p>
     <w:p>
@@ -628,7 +628,7 @@
       <w:r>
         <w:drawing>
           <wp:inline xmlns:a="http://schemas.openxmlformats.org/drawingml/2006/main" xmlns:pic="http://schemas.openxmlformats.org/drawingml/2006/picture">
-            <wp:extent cx="5897880" cy="4890077"/>
+            <wp:extent cx="5897880" cy="4829104"/>
             <wp:docPr id="5" name="Picture 5"/>
             <wp:cNvGraphicFramePr>
               <a:graphicFrameLocks noChangeAspect="1"/>
@@ -649,7 +649,7 @@
                   <pic:spPr>
                     <a:xfrm>
                       <a:off x="0" y="0"/>
-                      <a:ext cx="5897880" cy="4890077"/>
+                      <a:ext cx="5897880" cy="4829104"/>
                     </a:xfrm>
                     <a:prstGeom prst="rect"/>
                   </pic:spPr>
@@ -747,7 +747,17 @@
           </w:tcPr>
           <w:p>
             <w:r>
-              <w:t>0</w:t>
+              <w:t>18</w:t>
+            </w:r>
+          </w:p>
+        </w:tc>
+        <w:tc>
+          <w:tcPr>
+            <w:tcW w:type="dxa" w:w="2160"/>
+          </w:tcPr>
+          <w:p>
+            <w:r>
+              <w:t>2</w:t>
             </w:r>
           </w:p>
         </w:tc>
@@ -758,16 +768,6 @@
           <w:p>
             <w:r>
               <w:t>0</w:t>
-            </w:r>
-          </w:p>
-        </w:tc>
-        <w:tc>
-          <w:tcPr>
-            <w:tcW w:type="dxa" w:w="2160"/>
-          </w:tcPr>
-          <w:p>
-            <w:r>
-              <w:t>2</w:t>
             </w:r>
           </w:p>
         </w:tc>
@@ -789,7 +789,7 @@
           </w:tcPr>
           <w:p>
             <w:r>
-              <w:t>1</w:t>
+              <w:t>0</w:t>
             </w:r>
           </w:p>
         </w:tc>
@@ -799,7 +799,7 @@
           </w:tcPr>
           <w:p>
             <w:r>
-              <w:t>3</w:t>
+              <w:t>40</w:t>
             </w:r>
           </w:p>
         </w:tc>
@@ -809,7 +809,7 @@
           </w:tcPr>
           <w:p>
             <w:r>
-              <w:t>4</w:t>
+              <w:t>5</w:t>
             </w:r>
           </w:p>
         </w:tc>
@@ -831,7 +831,7 @@
           </w:tcPr>
           <w:p>
             <w:r>
-              <w:t>5</w:t>
+              <w:t>0</w:t>
             </w:r>
           </w:p>
         </w:tc>
@@ -841,7 +841,7 @@
           </w:tcPr>
           <w:p>
             <w:r>
-              <w:t>8</w:t>
+              <w:t>1</w:t>
             </w:r>
           </w:p>
         </w:tc>
@@ -851,7 +851,7 @@
           </w:tcPr>
           <w:p>
             <w:r>
-              <w:t>64</w:t>
+              <w:t>354</w:t>
             </w:r>
           </w:p>
         </w:tc>

</xml_diff>

<commit_message>
Add hosted app evaluation results
</commit_message>
<xml_diff>
--- a/reports/Fish_Kiln_AI_Model_and_App_Results.docx
+++ b/reports/Fish_Kiln_AI_Model_and_App_Results.docx
@@ -24,7 +24,7 @@
     </w:p>
     <w:p>
       <w:r>
-        <w:t>Generated: 2026-06-29</w:t>
+        <w:t>Generated: 2026-06-30</w:t>
       </w:r>
     </w:p>
     <w:p>
@@ -37,12 +37,12 @@
     </w:p>
     <w:p>
       <w:r>
-        <w:t>This report summarizes the current machine-learning model and application validation results for the fish kiln monitoring prototype. The model estimates remaining drying time from fish type, weight readings, temperature, humidity, elapsed time, and derived drying measurements.</w:t>
+        <w:t>This report summarizes the current machine-learning model and application validation results for the fish kiln monitoring system. The model estimates remaining drying time from fish type, weight readings, temperature, humidity, elapsed time, and derived drying measurements.</w:t>
       </w:r>
     </w:p>
     <w:p>
       <w:r>
-        <w:t>Important limitation: the current training dataset is synthetic demonstration data generated by the project pipeline. It should be presented as a prototype dataset until real experimental drying trials are collected and used for retraining.</w:t>
+        <w:t>Important limitation: the current training dataset is synthetic demonstration data generated by the project pipeline. It should be presented as synthetic demonstration data until real experimental drying trials are collected and used for retraining.</w:t>
       </w:r>
     </w:p>
     <w:p>
@@ -998,7 +998,7 @@
           </w:tcPr>
           <w:p>
             <w:r>
-              <w:t>170.8 KB in dist/assets</w:t>
+              <w:t>173.5 KB in dist/assets</w:t>
             </w:r>
           </w:p>
         </w:tc>
@@ -1214,6 +1214,116 @@
         </w:tc>
       </w:tr>
     </w:tbl>
+    <w:p>
+      <w:pPr>
+        <w:pStyle w:val="Heading2"/>
+      </w:pPr>
+      <w:r>
+        <w:t>Hosted Response-Time Evaluation</w:t>
+      </w:r>
+    </w:p>
+    <w:p>
+      <w:pPr>
+        <w:jc w:val="center"/>
+      </w:pPr>
+      <w:r>
+        <w:drawing>
+          <wp:inline xmlns:a="http://schemas.openxmlformats.org/drawingml/2006/main" xmlns:pic="http://schemas.openxmlformats.org/drawingml/2006/picture">
+            <wp:extent cx="5897880" cy="2541484"/>
+            <wp:docPr id="6" name="Picture 6"/>
+            <wp:cNvGraphicFramePr>
+              <a:graphicFrameLocks noChangeAspect="1"/>
+            </wp:cNvGraphicFramePr>
+            <a:graphic>
+              <a:graphicData uri="http://schemas.openxmlformats.org/drawingml/2006/picture">
+                <pic:pic>
+                  <pic:nvPicPr>
+                    <pic:cNvPr id="0" name="06_online_hosted_response_time.png"/>
+                    <pic:cNvPicPr/>
+                  </pic:nvPicPr>
+                  <pic:blipFill>
+                    <a:blip r:embed="rId14"/>
+                    <a:stretch>
+                      <a:fillRect/>
+                    </a:stretch>
+                  </pic:blipFill>
+                  <pic:spPr>
+                    <a:xfrm>
+                      <a:off x="0" y="0"/>
+                      <a:ext cx="5897880" cy="2541484"/>
+                    </a:xfrm>
+                    <a:prstGeom prst="rect"/>
+                  </pic:spPr>
+                </pic:pic>
+              </a:graphicData>
+            </a:graphic>
+          </wp:inline>
+        </w:drawing>
+      </w:r>
+    </w:p>
+    <w:p>
+      <w:pPr>
+        <w:pStyle w:val="Caption"/>
+      </w:pPr>
+      <w:r>
+        <w:t>Warm online response-time measurements from this PC/network to the hosted Vercel frontend and Render backend.</w:t>
+      </w:r>
+    </w:p>
+    <w:p>
+      <w:pPr>
+        <w:pStyle w:val="Heading2"/>
+      </w:pPr>
+      <w:r>
+        <w:t>Render Cold-Start Evaluation</w:t>
+      </w:r>
+    </w:p>
+    <w:p>
+      <w:pPr>
+        <w:jc w:val="center"/>
+      </w:pPr>
+      <w:r>
+        <w:drawing>
+          <wp:inline xmlns:a="http://schemas.openxmlformats.org/drawingml/2006/main" xmlns:pic="http://schemas.openxmlformats.org/drawingml/2006/picture">
+            <wp:extent cx="5897880" cy="2506031"/>
+            <wp:docPr id="7" name="Picture 7"/>
+            <wp:cNvGraphicFramePr>
+              <a:graphicFrameLocks noChangeAspect="1"/>
+            </wp:cNvGraphicFramePr>
+            <a:graphic>
+              <a:graphicData uri="http://schemas.openxmlformats.org/drawingml/2006/picture">
+                <pic:pic>
+                  <pic:nvPicPr>
+                    <pic:cNvPr id="0" name="07_render_cold_start_summary.png"/>
+                    <pic:cNvPicPr/>
+                  </pic:nvPicPr>
+                  <pic:blipFill>
+                    <a:blip r:embed="rId15"/>
+                    <a:stretch>
+                      <a:fillRect/>
+                    </a:stretch>
+                  </pic:blipFill>
+                  <pic:spPr>
+                    <a:xfrm>
+                      <a:off x="0" y="0"/>
+                      <a:ext cx="5897880" cy="2506031"/>
+                    </a:xfrm>
+                    <a:prstGeom prst="rect"/>
+                  </pic:spPr>
+                </pic:pic>
+              </a:graphicData>
+            </a:graphic>
+          </wp:inline>
+        </w:drawing>
+      </w:r>
+    </w:p>
+    <w:p>
+      <w:pPr>
+        <w:pStyle w:val="Caption"/>
+      </w:pPr>
+      <w:r>
+        <w:t>Separates Render free-tier cold-start delay from normal warm API response time.</w:t>
+      </w:r>
+    </w:p>
     <w:p>
       <w:pPr>
         <w:pStyle w:val="Heading1"/>

</xml_diff>